<commit_message>
docs: update cargo workflow and application contracts
</commit_message>
<xml_diff>
--- a/archive/source-documents/events/Поток_событий.docx
+++ b/archive/source-documents/events/Поток_событий.docx
@@ -645,6 +645,158 @@
       <w:pPr>
         <w:spacing w:before="200" w:after="100"/>
         <w:rPr>
+          <w:b/>
+          <w:bCs/>
+          <w:i/>
+          <w:iCs/>
+          <w:color w:val="000000"/>
+        </w:rPr>
+      </w:pPr>
+      <w:r>
+        <w:rPr>
+          <w:b/>
+          <w:bCs/>
+          <w:i/>
+          <w:iCs/>
+          <w:color w:val="000000"/>
+        </w:rPr>
+        <w:t xml:space="preserve">Под-поток «Создать учётную запись пользователя»</w:t>
+      </w:r>
+    </w:p>
+    <w:tbl>
+      <w:tblPr>
+        <w:tblStyle w:val="TableGrid"/>
+        <w:tblW w:w="0" w:type="auto"/>
+        <w:tblLook w:val="04A0" w:firstRow="1" w:lastRow="0" w:firstColumn="1" w:lastColumn="0" w:noHBand="0" w:noVBand="1"/>
+      </w:tblPr>
+      <w:tblGrid>
+        <w:gridCol w:w="3009"/>
+        <w:gridCol w:w="3009"/>
+        <w:gridCol w:w="3009"/>
+      </w:tblGrid>
+      <w:tr>
+        <w:tc>
+          <w:tcPr>
+            <w:tcW w:w="3009" w:type="dxa"/>
+          </w:tcPr>
+          <w:p>
+            <w:r>
+              <w:t xml:space="preserve">№</w:t>
+            </w:r>
+          </w:p>
+        </w:tc>
+        <w:tc>
+          <w:tcPr>
+            <w:tcW w:w="3009" w:type="dxa"/>
+          </w:tcPr>
+          <w:p>
+            <w:r>
+              <w:t xml:space="preserve">Действия исполнителя</w:t>
+            </w:r>
+          </w:p>
+        </w:tc>
+        <w:tc>
+          <w:tcPr>
+            <w:tcW w:w="3009" w:type="dxa"/>
+          </w:tcPr>
+          <w:p>
+            <w:r>
+              <w:t xml:space="preserve">Отклик системы</w:t>
+            </w:r>
+          </w:p>
+        </w:tc>
+      </w:tr>
+      <w:tr>
+        <w:tc>
+          <w:tcPr>
+            <w:tcW w:w="3009" w:type="dxa"/>
+          </w:tcPr>
+          <w:p>
+            <w:r>
+              <w:t xml:space="preserve">1</w:t>
+            </w:r>
+          </w:p>
+        </w:tc>
+        <w:tc>
+          <w:tcPr>
+            <w:tcW w:w="3009" w:type="dxa"/>
+          </w:tcPr>
+          <w:p>
+            <w:r>
+              <w:t xml:space="preserve">Администратор вводит имя пользователя</w:t>
+            </w:r>
+          </w:p>
+        </w:tc>
+        <w:tc>
+          <w:tcPr>
+            <w:tcW w:w="3009" w:type="dxa"/>
+          </w:tcPr>
+          <w:p/>
+        </w:tc>
+      </w:tr>
+      <w:tr>
+        <w:tc>
+          <w:tcPr>
+            <w:tcW w:w="3009" w:type="dxa"/>
+          </w:tcPr>
+          <w:p>
+            <w:r>
+              <w:t xml:space="preserve">2</w:t>
+            </w:r>
+          </w:p>
+        </w:tc>
+        <w:tc>
+          <w:tcPr>
+            <w:tcW w:w="3009" w:type="dxa"/>
+          </w:tcPr>
+          <w:p/>
+        </w:tc>
+        <w:tc>
+          <w:tcPr>
+            <w:tcW w:w="3009" w:type="dxa"/>
+          </w:tcPr>
+          <w:p>
+            <w:r>
+              <w:t xml:space="preserve">Создаёт учётную запись, идентификатор и временный пароль</w:t>
+            </w:r>
+          </w:p>
+        </w:tc>
+      </w:tr>
+      <w:tr>
+        <w:tc>
+          <w:tcPr>
+            <w:tcW w:w="3009" w:type="dxa"/>
+          </w:tcPr>
+          <w:p>
+            <w:r>
+              <w:t xml:space="preserve">3</w:t>
+            </w:r>
+          </w:p>
+        </w:tc>
+        <w:tc>
+          <w:tcPr>
+            <w:tcW w:w="3009" w:type="dxa"/>
+          </w:tcPr>
+          <w:p/>
+        </w:tc>
+        <w:tc>
+          <w:tcPr>
+            <w:tcW w:w="3009" w:type="dxa"/>
+          </w:tcPr>
+          <w:p>
+            <w:r>
+              <w:t xml:space="preserve">Показывает идентификатор и временный пароль администратору</w:t>
+            </w:r>
+          </w:p>
+        </w:tc>
+      </w:tr>
+    </w:tbl>
+    <w:p>
+      <w:pPr>
+        <w:spacing w:before="200" w:after="100"/>
+        <w:rPr>
+          <w:i/>
+          <w:iCs/>
           <w:color w:val="000000"/>
         </w:rPr>
       </w:pPr>
@@ -6070,7 +6222,7 @@
               <w:rPr>
                 <w:color w:val="000000"/>
               </w:rPr>
-              <w:t xml:space="preserve">Просит ввести идентификационный номер пользователя, отправляющего груз</w:t>
+              <w:t xml:space="preserve">Показывает заявки со статусом «ожидает приёма» на станции оператора</w:t>
             </w:r>
           </w:p>
         </w:tc>
@@ -6108,7 +6260,7 @@
               <w:rPr>
                 <w:color w:val="000000"/>
               </w:rPr>
-              <w:t xml:space="preserve">Вводит идентификационный номер пользователя</w:t>
+              <w:t xml:space="preserve">Выбирает заявку</w:t>
             </w:r>
           </w:p>
         </w:tc>
@@ -6170,7 +6322,7 @@
               <w:rPr>
                 <w:color w:val="000000"/>
               </w:rPr>
-              <w:t xml:space="preserve">Просит ввести данные груза (описание, вес, станция назначения)</w:t>
+              <w:t xml:space="preserve">Проверяет, что заявка относится к станции отправления оператора</w:t>
             </w:r>
           </w:p>
         </w:tc>
@@ -6208,7 +6360,7 @@
               <w:rPr>
                 <w:color w:val="000000"/>
               </w:rPr>
-              <w:t xml:space="preserve">Вводит данные груза</w:t>
+              <w:t xml:space="preserve">Подтверждает приём заявки</w:t>
             </w:r>
           </w:p>
         </w:tc>
@@ -6270,7 +6422,7 @@
               <w:rPr>
                 <w:color w:val="000000"/>
               </w:rPr>
-              <w:t xml:space="preserve">Присваивает грузу идентификатор и статус «принят на станции»</w:t>
+              <w:t xml:space="preserve">Меняет статус груза на «принят на станции»</w:t>
             </w:r>
           </w:p>
         </w:tc>
@@ -6320,7 +6472,7 @@
               <w:rPr>
                 <w:color w:val="000000"/>
               </w:rPr>
-              <w:t xml:space="preserve">Сохраняет груз в списке грузов станции</w:t>
+              <w:t xml:space="preserve">Сохраняет изменение заявки в списке грузов станции</w:t>
             </w:r>
           </w:p>
         </w:tc>
@@ -6348,18 +6500,22 @@
       <w:pPr>
         <w:spacing w:before="200" w:after="80"/>
         <w:rPr>
-          <w:color w:val="000000"/>
-        </w:rPr>
-      </w:pPr>
-      <w:r>
-        <w:rPr>
           <w:b/>
           <w:bCs/>
           <w:i/>
           <w:iCs/>
           <w:color w:val="000000"/>
         </w:rPr>
-        <w:t xml:space="preserve">4. Неверный идентификационный номер пользователя</w:t>
+      </w:pPr>
+      <w:r>
+        <w:rPr>
+          <w:b/>
+          <w:bCs/>
+          <w:i/>
+          <w:iCs/>
+          <w:color w:val="000000"/>
+        </w:rPr>
+        <w:t xml:space="preserve">3. Заявка не найдена или относится к другой станции</w:t>
       </w:r>
     </w:p>
     <w:tbl>
@@ -6496,7 +6652,7 @@
               <w:rPr>
                 <w:color w:val="000000"/>
               </w:rPr>
-              <w:t xml:space="preserve">Выдаёт сообщение об ошибке и запрашивает снова номер пользователя</w:t>
+              <w:t xml:space="preserve">Выдаёт сообщение об ошибке: заявка не найдена или относится к другой станции</w:t>
             </w:r>
           </w:p>
         </w:tc>
@@ -6606,18 +6762,22 @@
       <w:pPr>
         <w:spacing w:before="200" w:after="80"/>
         <w:rPr>
-          <w:color w:val="000000"/>
-        </w:rPr>
-      </w:pPr>
-      <w:r>
-        <w:rPr>
           <w:b/>
           <w:bCs/>
           <w:i/>
           <w:iCs/>
           <w:color w:val="000000"/>
         </w:rPr>
-        <w:t xml:space="preserve">6. Некорректные данные груза</w:t>
+      </w:pPr>
+      <w:r>
+        <w:rPr>
+          <w:b/>
+          <w:bCs/>
+          <w:i/>
+          <w:iCs/>
+          <w:color w:val="000000"/>
+        </w:rPr>
+        <w:t xml:space="preserve">3. Заявка уже обработана</w:t>
       </w:r>
     </w:p>
     <w:tbl>
@@ -6754,7 +6914,7 @@
               <w:rPr>
                 <w:color w:val="000000"/>
               </w:rPr>
-              <w:t xml:space="preserve">Выдаёт сообщение об ошибке и запрашивает данные повторно</w:t>
+              <w:t xml:space="preserve">Выдаёт сообщение об ошибке: заявка уже обработана; обновите список</w:t>
             </w:r>
           </w:p>
         </w:tc>
@@ -6792,7 +6952,7 @@
               <w:rPr>
                 <w:color w:val="000000"/>
               </w:rPr>
-              <w:t xml:space="preserve">Вводит данные заново</w:t>
+              <w:t xml:space="preserve">Обновляет список заявок</w:t>
             </w:r>
           </w:p>
         </w:tc>
@@ -6904,6 +7064,214 @@
       <w:pPr>
         <w:spacing w:before="200" w:after="100"/>
         <w:rPr>
+          <w:b/>
+          <w:bCs/>
+          <w:i/>
+          <w:iCs/>
+          <w:color w:val="000000"/>
+        </w:rPr>
+      </w:pPr>
+      <w:r>
+        <w:rPr>
+          <w:b/>
+          <w:bCs/>
+          <w:i/>
+          <w:iCs/>
+          <w:color w:val="000000"/>
+        </w:rPr>
+        <w:t xml:space="preserve">Под-поток «Просмотреть список грузов станции»</w:t>
+      </w:r>
+    </w:p>
+    <w:tbl>
+      <w:tblPr>
+        <w:tblStyle w:val="TableGrid"/>
+        <w:tblW w:w="0" w:type="auto"/>
+        <w:tblLook w:val="04A0" w:firstRow="1" w:lastRow="0" w:firstColumn="1" w:lastColumn="0" w:noHBand="0" w:noVBand="1"/>
+      </w:tblPr>
+      <w:tblGrid>
+        <w:gridCol w:w="3009"/>
+        <w:gridCol w:w="3009"/>
+        <w:gridCol w:w="3009"/>
+      </w:tblGrid>
+      <w:tr>
+        <w:tc>
+          <w:tcPr>
+            <w:tcW w:w="3009" w:type="dxa"/>
+          </w:tcPr>
+          <w:p>
+            <w:r>
+              <w:t xml:space="preserve">№</w:t>
+            </w:r>
+          </w:p>
+        </w:tc>
+        <w:tc>
+          <w:tcPr>
+            <w:tcW w:w="3009" w:type="dxa"/>
+          </w:tcPr>
+          <w:p>
+            <w:r>
+              <w:t xml:space="preserve">Действия исполнителя</w:t>
+            </w:r>
+          </w:p>
+        </w:tc>
+        <w:tc>
+          <w:tcPr>
+            <w:tcW w:w="3009" w:type="dxa"/>
+          </w:tcPr>
+          <w:p>
+            <w:r>
+              <w:t xml:space="preserve">Отклик системы</w:t>
+            </w:r>
+          </w:p>
+        </w:tc>
+      </w:tr>
+      <w:tr>
+        <w:tc>
+          <w:tcPr>
+            <w:tcW w:w="3009" w:type="dxa"/>
+          </w:tcPr>
+          <w:p>
+            <w:r>
+              <w:t xml:space="preserve">1</w:t>
+            </w:r>
+          </w:p>
+        </w:tc>
+        <w:tc>
+          <w:tcPr>
+            <w:tcW w:w="3009" w:type="dxa"/>
+          </w:tcPr>
+          <w:p>
+            <w:r>
+              <w:t xml:space="preserve">Оператор вводит свой идентификационный номер и пароль</w:t>
+            </w:r>
+          </w:p>
+        </w:tc>
+        <w:tc>
+          <w:tcPr>
+            <w:tcW w:w="3009" w:type="dxa"/>
+          </w:tcPr>
+          <w:p/>
+        </w:tc>
+      </w:tr>
+      <w:tr>
+        <w:tc>
+          <w:tcPr>
+            <w:tcW w:w="3009" w:type="dxa"/>
+          </w:tcPr>
+          <w:p>
+            <w:r>
+              <w:t xml:space="preserve">2</w:t>
+            </w:r>
+          </w:p>
+        </w:tc>
+        <w:tc>
+          <w:tcPr>
+            <w:tcW w:w="3009" w:type="dxa"/>
+          </w:tcPr>
+          <w:p/>
+        </w:tc>
+        <w:tc>
+          <w:tcPr>
+            <w:tcW w:w="3009" w:type="dxa"/>
+          </w:tcPr>
+          <w:p>
+            <w:r>
+              <w:t xml:space="preserve">Проверяет идентификационный номер и пароль</w:t>
+            </w:r>
+          </w:p>
+        </w:tc>
+      </w:tr>
+      <w:tr>
+        <w:tc>
+          <w:tcPr>
+            <w:tcW w:w="3009" w:type="dxa"/>
+          </w:tcPr>
+          <w:p>
+            <w:r>
+              <w:t xml:space="preserve">3</w:t>
+            </w:r>
+          </w:p>
+        </w:tc>
+        <w:tc>
+          <w:tcPr>
+            <w:tcW w:w="3009" w:type="dxa"/>
+          </w:tcPr>
+          <w:p>
+            <w:r>
+              <w:t xml:space="preserve">Оператор запрашивает список грузов своей станции</w:t>
+            </w:r>
+          </w:p>
+        </w:tc>
+        <w:tc>
+          <w:tcPr>
+            <w:tcW w:w="3009" w:type="dxa"/>
+          </w:tcPr>
+          <w:p/>
+        </w:tc>
+      </w:tr>
+      <w:tr>
+        <w:tc>
+          <w:tcPr>
+            <w:tcW w:w="3009" w:type="dxa"/>
+          </w:tcPr>
+          <w:p>
+            <w:r>
+              <w:t xml:space="preserve">4</w:t>
+            </w:r>
+          </w:p>
+        </w:tc>
+        <w:tc>
+          <w:tcPr>
+            <w:tcW w:w="3009" w:type="dxa"/>
+          </w:tcPr>
+          <w:p/>
+        </w:tc>
+        <w:tc>
+          <w:tcPr>
+            <w:tcW w:w="3009" w:type="dxa"/>
+          </w:tcPr>
+          <w:p>
+            <w:r>
+              <w:t xml:space="preserve">Выводит только грузы своей станции: идентификатор, описание, статус и текущее местонахождение. Если список пуст, выводит информационное сообщение.</w:t>
+            </w:r>
+          </w:p>
+        </w:tc>
+      </w:tr>
+      <w:tr>
+        <w:tc>
+          <w:tcPr>
+            <w:tcW w:w="3009" w:type="dxa"/>
+          </w:tcPr>
+          <w:p>
+            <w:r>
+              <w:t xml:space="preserve">5</w:t>
+            </w:r>
+          </w:p>
+        </w:tc>
+        <w:tc>
+          <w:tcPr>
+            <w:tcW w:w="3009" w:type="dxa"/>
+          </w:tcPr>
+          <w:p>
+            <w:r>
+              <w:t xml:space="preserve">Оператор просматривает список</w:t>
+            </w:r>
+          </w:p>
+        </w:tc>
+        <w:tc>
+          <w:tcPr>
+            <w:tcW w:w="3009" w:type="dxa"/>
+          </w:tcPr>
+          <w:p/>
+        </w:tc>
+      </w:tr>
+    </w:tbl>
+    <w:p>
+      <w:pPr>
+        <w:spacing w:before="200" w:after="100"/>
+        <w:rPr>
+          <w:i/>
+          <w:iCs/>
           <w:color w:val="000000"/>
         </w:rPr>
       </w:pPr>
@@ -7150,7 +7518,7 @@
               <w:rPr>
                 <w:color w:val="000000"/>
               </w:rPr>
-              <w:t xml:space="preserve">Выводит список принятых грузов на станции</w:t>
+              <w:t xml:space="preserve">Выводит список грузов станции со статусом «принят на станции»</w:t>
             </w:r>
           </w:p>
         </w:tc>
@@ -7250,7 +7618,7 @@
               <w:rPr>
                 <w:color w:val="000000"/>
               </w:rPr>
-              <w:t xml:space="preserve">Выводит список поездов, следующих до станции назначения груза</w:t>
+              <w:t xml:space="preserve">Выводит список поездов по прямому направлению от станции оператора до станции назначения груза</w:t>
             </w:r>
           </w:p>
         </w:tc>
@@ -7710,6 +8078,8 @@
       <w:pPr>
         <w:spacing w:before="200" w:after="100"/>
         <w:rPr>
+          <w:i/>
+          <w:iCs/>
           <w:color w:val="000000"/>
         </w:rPr>
       </w:pPr>
@@ -7719,7 +8089,265 @@
           <w:iCs/>
           <w:color w:val="000000"/>
         </w:rPr>
-        <w:t xml:space="preserve">Таблица 8 — Основной поток события: Получение груза</w:t>
+        <w:t xml:space="preserve">Таблица 8 — Основной поток события: Регистрация прибытия поезда</w:t>
+      </w:r>
+    </w:p>
+    <w:tbl>
+      <w:tblPr>
+        <w:tblStyle w:val="TableGrid"/>
+        <w:tblW w:w="0" w:type="auto"/>
+        <w:tblLook w:val="04A0" w:firstRow="1" w:lastRow="0" w:firstColumn="1" w:lastColumn="0" w:noHBand="0" w:noVBand="1"/>
+      </w:tblPr>
+      <w:tblGrid>
+        <w:gridCol w:w="3009"/>
+        <w:gridCol w:w="3009"/>
+        <w:gridCol w:w="3009"/>
+      </w:tblGrid>
+      <w:tr>
+        <w:tc>
+          <w:tcPr>
+            <w:tcW w:w="3009" w:type="dxa"/>
+          </w:tcPr>
+          <w:p>
+            <w:r>
+              <w:t xml:space="preserve">№</w:t>
+            </w:r>
+          </w:p>
+        </w:tc>
+        <w:tc>
+          <w:tcPr>
+            <w:tcW w:w="3009" w:type="dxa"/>
+          </w:tcPr>
+          <w:p>
+            <w:r>
+              <w:t xml:space="preserve">Действия исполнителя</w:t>
+            </w:r>
+          </w:p>
+        </w:tc>
+        <w:tc>
+          <w:tcPr>
+            <w:tcW w:w="3009" w:type="dxa"/>
+          </w:tcPr>
+          <w:p>
+            <w:r>
+              <w:t xml:space="preserve">Отклик системы</w:t>
+            </w:r>
+          </w:p>
+        </w:tc>
+      </w:tr>
+      <w:tr>
+        <w:tc>
+          <w:tcPr>
+            <w:tcW w:w="3009" w:type="dxa"/>
+          </w:tcPr>
+          <w:p>
+            <w:r>
+              <w:t xml:space="preserve">1</w:t>
+            </w:r>
+          </w:p>
+        </w:tc>
+        <w:tc>
+          <w:tcPr>
+            <w:tcW w:w="3009" w:type="dxa"/>
+          </w:tcPr>
+          <w:p>
+            <w:r>
+              <w:t xml:space="preserve">Оператор вводит свой идентификационный номер и пароль</w:t>
+            </w:r>
+          </w:p>
+        </w:tc>
+        <w:tc>
+          <w:tcPr>
+            <w:tcW w:w="3009" w:type="dxa"/>
+          </w:tcPr>
+          <w:p/>
+        </w:tc>
+      </w:tr>
+      <w:tr>
+        <w:tc>
+          <w:tcPr>
+            <w:tcW w:w="3009" w:type="dxa"/>
+          </w:tcPr>
+          <w:p>
+            <w:r>
+              <w:t xml:space="preserve">2</w:t>
+            </w:r>
+          </w:p>
+        </w:tc>
+        <w:tc>
+          <w:tcPr>
+            <w:tcW w:w="3009" w:type="dxa"/>
+          </w:tcPr>
+          <w:p/>
+        </w:tc>
+        <w:tc>
+          <w:tcPr>
+            <w:tcW w:w="3009" w:type="dxa"/>
+          </w:tcPr>
+          <w:p>
+            <w:r>
+              <w:t xml:space="preserve">Проверяет идентификационный номер и пароль</w:t>
+            </w:r>
+          </w:p>
+        </w:tc>
+      </w:tr>
+      <w:tr>
+        <w:tc>
+          <w:tcPr>
+            <w:tcW w:w="3009" w:type="dxa"/>
+          </w:tcPr>
+          <w:p>
+            <w:r>
+              <w:t xml:space="preserve">3</w:t>
+            </w:r>
+          </w:p>
+        </w:tc>
+        <w:tc>
+          <w:tcPr>
+            <w:tcW w:w="3009" w:type="dxa"/>
+          </w:tcPr>
+          <w:p/>
+        </w:tc>
+        <w:tc>
+          <w:tcPr>
+            <w:tcW w:w="3009" w:type="dxa"/>
+          </w:tcPr>
+          <w:p>
+            <w:r>
+              <w:t xml:space="preserve">Просит выбрать прибывший поезд</w:t>
+            </w:r>
+          </w:p>
+        </w:tc>
+      </w:tr>
+      <w:tr>
+        <w:tc>
+          <w:tcPr>
+            <w:tcW w:w="3009" w:type="dxa"/>
+          </w:tcPr>
+          <w:p>
+            <w:r>
+              <w:t xml:space="preserve">4</w:t>
+            </w:r>
+          </w:p>
+        </w:tc>
+        <w:tc>
+          <w:tcPr>
+            <w:tcW w:w="3009" w:type="dxa"/>
+          </w:tcPr>
+          <w:p>
+            <w:r>
+              <w:t xml:space="preserve">Оператор выбирает поезд</w:t>
+            </w:r>
+          </w:p>
+        </w:tc>
+        <w:tc>
+          <w:tcPr>
+            <w:tcW w:w="3009" w:type="dxa"/>
+          </w:tcPr>
+          <w:p/>
+        </w:tc>
+      </w:tr>
+      <w:tr>
+        <w:tc>
+          <w:tcPr>
+            <w:tcW w:w="3009" w:type="dxa"/>
+          </w:tcPr>
+          <w:p>
+            <w:r>
+              <w:t xml:space="preserve">5</w:t>
+            </w:r>
+          </w:p>
+        </w:tc>
+        <w:tc>
+          <w:tcPr>
+            <w:tcW w:w="3009" w:type="dxa"/>
+          </w:tcPr>
+          <w:p/>
+        </w:tc>
+        <w:tc>
+          <w:tcPr>
+            <w:tcW w:w="3009" w:type="dxa"/>
+          </w:tcPr>
+          <w:p>
+            <w:r>
+              <w:t xml:space="preserve">Проверяет, что конечная станция поезда совпадает со станцией оператора</w:t>
+            </w:r>
+          </w:p>
+        </w:tc>
+      </w:tr>
+      <w:tr>
+        <w:tc>
+          <w:tcPr>
+            <w:tcW w:w="3009" w:type="dxa"/>
+          </w:tcPr>
+          <w:p>
+            <w:r>
+              <w:t xml:space="preserve">6</w:t>
+            </w:r>
+          </w:p>
+        </w:tc>
+        <w:tc>
+          <w:tcPr>
+            <w:tcW w:w="3009" w:type="dxa"/>
+          </w:tcPr>
+          <w:p>
+            <w:r>
+              <w:t xml:space="preserve">Оператор подтверждает прибытие</w:t>
+            </w:r>
+          </w:p>
+        </w:tc>
+        <w:tc>
+          <w:tcPr>
+            <w:tcW w:w="3009" w:type="dxa"/>
+          </w:tcPr>
+          <w:p/>
+        </w:tc>
+      </w:tr>
+      <w:tr>
+        <w:tc>
+          <w:tcPr>
+            <w:tcW w:w="3009" w:type="dxa"/>
+          </w:tcPr>
+          <w:p>
+            <w:r>
+              <w:t xml:space="preserve">7</w:t>
+            </w:r>
+          </w:p>
+        </w:tc>
+        <w:tc>
+          <w:tcPr>
+            <w:tcW w:w="3009" w:type="dxa"/>
+          </w:tcPr>
+          <w:p/>
+        </w:tc>
+        <w:tc>
+          <w:tcPr>
+            <w:tcW w:w="3009" w:type="dxa"/>
+          </w:tcPr>
+          <w:p>
+            <w:r>
+              <w:t xml:space="preserve">Устанавливает статус поезда «прибыл»</w:t>
+            </w:r>
+          </w:p>
+        </w:tc>
+      </w:tr>
+    </w:tbl>
+    <w:p>
+      <w:pPr>
+        <w:spacing w:before="200" w:after="100"/>
+        <w:rPr>
+          <w:i/>
+          <w:iCs/>
+          <w:color w:val="000000"/>
+        </w:rPr>
+      </w:pPr>
+      <w:r>
+        <w:rPr>
+          <w:i/>
+          <w:iCs/>
+          <w:color w:val="000000"/>
+        </w:rPr>
+        <w:t xml:space="preserve">Таблица 9 — Основной поток события: Выгрузка груза на станции назначения</w:t>
       </w:r>
     </w:p>
     <w:tbl>
@@ -7956,7 +8584,7 @@
               <w:rPr>
                 <w:color w:val="000000"/>
               </w:rPr>
-              <w:t xml:space="preserve">Просит ввести идентификатор прибывшего груза</w:t>
+              <w:t xml:space="preserve">Выводит грузы «в пути», направленные на станцию оператора</w:t>
             </w:r>
           </w:p>
         </w:tc>
@@ -7994,7 +8622,7 @@
               <w:rPr>
                 <w:color w:val="000000"/>
               </w:rPr>
-              <w:t xml:space="preserve">Вводит идентификатор груза</w:t>
+              <w:t xml:space="preserve">Выбирает груз из списка</w:t>
             </w:r>
           </w:p>
         </w:tc>
@@ -8056,7 +8684,7 @@
               <w:rPr>
                 <w:color w:val="000000"/>
               </w:rPr>
-              <w:t xml:space="preserve">Проверяет, что груз числится «в пути» и его поезд прибыл на станцию</w:t>
+              <w:t xml:space="preserve">Проверяет статус поезда «прибыл» и станцию назначения груза</w:t>
             </w:r>
           </w:p>
         </w:tc>
@@ -8106,7 +8734,7 @@
               <w:rPr>
                 <w:color w:val="000000"/>
               </w:rPr>
-              <w:t xml:space="preserve">Меняет статус груза на «получен»</w:t>
+              <w:t xml:space="preserve">Меняет статус груза на «доступен к выдаче»</w:t>
             </w:r>
           </w:p>
         </w:tc>
@@ -8156,7 +8784,7 @@
               <w:rPr>
                 <w:color w:val="000000"/>
               </w:rPr>
-              <w:t xml:space="preserve">Груз становится доступен пользователю для получения</w:t>
+              <w:t xml:space="preserve">Показывает пользователю, что груз готов к выдаче</w:t>
             </w:r>
           </w:p>
         </w:tc>
@@ -8465,6 +9093,8 @@
       <w:pPr>
         <w:spacing w:before="200" w:after="100"/>
         <w:rPr>
+          <w:i/>
+          <w:iCs/>
           <w:color w:val="000000"/>
         </w:rPr>
       </w:pPr>
@@ -8474,7 +9104,7 @@
           <w:iCs/>
           <w:color w:val="000000"/>
         </w:rPr>
-        <w:t xml:space="preserve">Таблица 9 — Основной поток события: Работа с грузами</w:t>
+        <w:t xml:space="preserve">Таблица 10 — Основной поток события: Работа с грузами</w:t>
       </w:r>
     </w:p>
     <w:tbl>
@@ -9097,7 +9727,7 @@
               <w:rPr>
                 <w:color w:val="000000"/>
               </w:rPr>
-              <w:t xml:space="preserve">Пользователь вводит данные груза: наименование, вес, получатель</w:t>
+              <w:t xml:space="preserve">Пользователь вводит описание и вес, выбирает получателя</w:t>
             </w:r>
           </w:p>
         </w:tc>
@@ -9147,7 +9777,7 @@
               <w:rPr>
                 <w:color w:val="000000"/>
               </w:rPr>
-              <w:t xml:space="preserve">Выбирает станцию отправления и станцию назначения</w:t>
+              <w:t xml:space="preserve">Просматривает список станций и выбирает отправление и назначение</w:t>
             </w:r>
           </w:p>
         </w:tc>
@@ -9617,7 +10247,7 @@
               <w:rPr>
                 <w:color w:val="000000"/>
               </w:rPr>
-              <w:t xml:space="preserve">Выводит текущий статус груза («ожидает приёма» / «принят на станции» / «в пути» / «получен») и станцию местонахождения</w:t>
+              <w:t xml:space="preserve">Выводит статус груза («ожидает приёма» / «принят на станции» / «в пути» / «доступен к выдаче» / «получен») и станцию местонахождения</w:t>
             </w:r>
           </w:p>
         </w:tc>
@@ -9627,6 +10257,188 @@
       <w:pPr>
         <w:spacing w:before="200" w:after="80"/>
         <w:rPr>
+          <w:b/>
+          <w:bCs/>
+          <w:i/>
+          <w:iCs/>
+          <w:color w:val="000000"/>
+        </w:rPr>
+      </w:pPr>
+      <w:r>
+        <w:rPr>
+          <w:b/>
+          <w:bCs/>
+          <w:i/>
+          <w:iCs/>
+          <w:color w:val="000000"/>
+        </w:rPr>
+        <w:t xml:space="preserve">Под-поток 4.2.1 «Подтвердить получение груза»</w:t>
+      </w:r>
+    </w:p>
+    <w:tbl>
+      <w:tblPr>
+        <w:tblStyle w:val="TableGrid"/>
+        <w:tblW w:w="0" w:type="auto"/>
+        <w:tblLook w:val="04A0" w:firstRow="1" w:lastRow="0" w:firstColumn="1" w:lastColumn="0" w:noHBand="0" w:noVBand="1"/>
+      </w:tblPr>
+      <w:tblGrid>
+        <w:gridCol w:w="3009"/>
+        <w:gridCol w:w="3009"/>
+        <w:gridCol w:w="3009"/>
+      </w:tblGrid>
+      <w:tr>
+        <w:tc>
+          <w:tcPr>
+            <w:tcW w:w="3009" w:type="dxa"/>
+          </w:tcPr>
+          <w:p>
+            <w:r>
+              <w:t xml:space="preserve">№</w:t>
+            </w:r>
+          </w:p>
+        </w:tc>
+        <w:tc>
+          <w:tcPr>
+            <w:tcW w:w="3009" w:type="dxa"/>
+          </w:tcPr>
+          <w:p>
+            <w:r>
+              <w:t xml:space="preserve">Действия исполнителя</w:t>
+            </w:r>
+          </w:p>
+        </w:tc>
+        <w:tc>
+          <w:tcPr>
+            <w:tcW w:w="3009" w:type="dxa"/>
+          </w:tcPr>
+          <w:p>
+            <w:r>
+              <w:t xml:space="preserve">Отклик системы</w:t>
+            </w:r>
+          </w:p>
+        </w:tc>
+      </w:tr>
+      <w:tr>
+        <w:tc>
+          <w:tcPr>
+            <w:tcW w:w="3009" w:type="dxa"/>
+          </w:tcPr>
+          <w:p>
+            <w:r>
+              <w:t xml:space="preserve">1</w:t>
+            </w:r>
+          </w:p>
+        </w:tc>
+        <w:tc>
+          <w:tcPr>
+            <w:tcW w:w="3009" w:type="dxa"/>
+          </w:tcPr>
+          <w:p>
+            <w:r>
+              <w:t xml:space="preserve">Получатель вводит идентификатор груза</w:t>
+            </w:r>
+          </w:p>
+        </w:tc>
+        <w:tc>
+          <w:tcPr>
+            <w:tcW w:w="3009" w:type="dxa"/>
+          </w:tcPr>
+          <w:p/>
+        </w:tc>
+      </w:tr>
+      <w:tr>
+        <w:tc>
+          <w:tcPr>
+            <w:tcW w:w="3009" w:type="dxa"/>
+          </w:tcPr>
+          <w:p>
+            <w:r>
+              <w:t xml:space="preserve">2</w:t>
+            </w:r>
+          </w:p>
+        </w:tc>
+        <w:tc>
+          <w:tcPr>
+            <w:tcW w:w="3009" w:type="dxa"/>
+          </w:tcPr>
+          <w:p/>
+        </w:tc>
+        <w:tc>
+          <w:tcPr>
+            <w:tcW w:w="3009" w:type="dxa"/>
+          </w:tcPr>
+          <w:p>
+            <w:r>
+              <w:t xml:space="preserve">Проверяет, что груз доступен к выдаче и получатель назначен на груз</w:t>
+            </w:r>
+          </w:p>
+        </w:tc>
+      </w:tr>
+      <w:tr>
+        <w:tc>
+          <w:tcPr>
+            <w:tcW w:w="3009" w:type="dxa"/>
+          </w:tcPr>
+          <w:p>
+            <w:r>
+              <w:t xml:space="preserve">3</w:t>
+            </w:r>
+          </w:p>
+        </w:tc>
+        <w:tc>
+          <w:tcPr>
+            <w:tcW w:w="3009" w:type="dxa"/>
+          </w:tcPr>
+          <w:p>
+            <w:r>
+              <w:t xml:space="preserve">Получатель подтверждает выдачу</w:t>
+            </w:r>
+          </w:p>
+        </w:tc>
+        <w:tc>
+          <w:tcPr>
+            <w:tcW w:w="3009" w:type="dxa"/>
+          </w:tcPr>
+          <w:p/>
+        </w:tc>
+      </w:tr>
+      <w:tr>
+        <w:tc>
+          <w:tcPr>
+            <w:tcW w:w="3009" w:type="dxa"/>
+          </w:tcPr>
+          <w:p>
+            <w:r>
+              <w:t xml:space="preserve">4</w:t>
+            </w:r>
+          </w:p>
+        </w:tc>
+        <w:tc>
+          <w:tcPr>
+            <w:tcW w:w="3009" w:type="dxa"/>
+          </w:tcPr>
+          <w:p/>
+        </w:tc>
+        <w:tc>
+          <w:tcPr>
+            <w:tcW w:w="3009" w:type="dxa"/>
+          </w:tcPr>
+          <w:p>
+            <w:r>
+              <w:t xml:space="preserve">Меняет статус груза на «получен» и показывает подтверждение</w:t>
+            </w:r>
+          </w:p>
+        </w:tc>
+      </w:tr>
+    </w:tbl>
+    <w:p>
+      <w:pPr>
+        <w:spacing w:before="200" w:after="80"/>
+        <w:rPr>
+          <w:b/>
+          <w:bCs/>
+          <w:i/>
+          <w:iCs/>
           <w:color w:val="000000"/>
         </w:rPr>
       </w:pPr>
@@ -10309,7 +11121,7 @@
               <w:rPr>
                 <w:color w:val="000000"/>
               </w:rPr>
-              <w:t xml:space="preserve">Выдаёт сообщение об ошибке «Между выбранными станциями нет маршрута»</w:t>
+              <w:t xml:space="preserve">Выдаёт сообщение об ошибке «Между выбранными станциями нет прямого сообщения»</w:t>
             </w:r>
           </w:p>
         </w:tc>

</xml_diff>